<commit_message>
Update resume and career documents
</commit_message>
<xml_diff>
--- a/career/resume-2026.docx
+++ b/career/resume-2026.docx
@@ -40,13 +40,14 @@
           <w:color w:val="475569"/>
           <w:sz w:val="19"/>
         </w:rPr>
-        <w:t>Monastir, Tunisia  |  alabaganne9@gmail.com  |  +216 50 101 959</w:t>
+        <w:t xml:space="preserve">Monastir, Tunisia  |  alabaganne9@gmail.com  |  +216 50 101 959</w:t>
         <w:br/>
-        <w:t>linkedin.com/in/alabaganne  |  github.com/alabaganne  |  alabaganne.com</w:t>
+        <w:t xml:space="preserve">linkedin.com/in/alabaganne  |  github.com/alabaganne  |  alabaganne.com</w:t>
       </w:r>
     </w:p>
     <w:p>
       <w:pPr>
+        <w:keepNext/>
         <w:spacing w:before="160" w:after="40"/>
         <w:pBdr>
           <w:bottom w:val="single" w:sz="6" w:space="1" w:color="1D4ED8"/>
@@ -63,11 +64,12 @@
     </w:p>
     <w:p>
       <w:r>
-        <w:t>Full-Stack Software Engineer with 5+ years of experience building web applications, AI features, custom Shopify themes, e-commerce stores, and landing pages for individuals and businesses. Core contributor to a platform serving 25,000+ users. Upwork Top Rated with a 100% Job Success Score.</w:t>
+        <w:t>Full-stack software engineer with five years of professional experience building and maintaining production web applications with React, Next.js, TypeScript, Node.js, Supabase, and PostgreSQL, plus applied AI (RAG, LLM workflows, OCR). Core contributor to RetainYourBrain, a healthcare platform serving 30,000+ users, and former team lead on NORA, an AI legal document platform. Founder of MenuMate and builder of KartaTunisie and PromptStream. Upwork Top Rated with a 100% Job Success Score.</w:t>
       </w:r>
     </w:p>
     <w:p>
       <w:pPr>
+        <w:keepNext/>
         <w:spacing w:before="160" w:after="40"/>
         <w:pBdr>
           <w:bottom w:val="single" w:sz="6" w:space="1" w:color="1D4ED8"/>
@@ -91,13 +93,13 @@
           <w:b/>
           <w:sz w:val="20"/>
         </w:rPr>
-        <w:t xml:space="preserve">AI &amp; Modern Stack:  </w:t>
+        <w:t xml:space="preserve">Languages:  </w:t>
       </w:r>
       <w:r>
         <w:rPr>
           <w:sz w:val="20"/>
         </w:rPr>
-        <w:t>LLM Integration, RAG Systems, DSPy, OpenAI API, Vertex AI, Vector DBs, OCR, Apache Tika, AI Agents</w:t>
+        <w:t>TypeScript, JavaScript, Python, PHP, SQL, HTML5, CSS3</w:t>
       </w:r>
     </w:p>
     <w:p>
@@ -115,7 +117,7 @@
         <w:rPr>
           <w:sz w:val="20"/>
         </w:rPr>
-        <w:t>React.js, Next.js, TypeScript, Vue.js, AngularJS, Tailwind CSS, Shadcn UI, React Native, Shopify, Custom Themes, WordPress</w:t>
+        <w:t>React, Next.js, React Native, Vue.js, AngularJS, Tailwind CSS, shadcn/ui, Electron, Shopify themes, WordPress</w:t>
       </w:r>
     </w:p>
     <w:p>
@@ -133,7 +135,7 @@
         <w:rPr>
           <w:sz w:val="20"/>
         </w:rPr>
-        <w:t>Node.js, NestJS, Express.js, FastAPI, Laravel</w:t>
+        <w:t>Node.js, Express.js, NestJS, FastAPI, Laravel, REST APIs, Stripe, Square</w:t>
       </w:r>
     </w:p>
     <w:p>
@@ -145,13 +147,31 @@
           <w:b/>
           <w:sz w:val="20"/>
         </w:rPr>
-        <w:t xml:space="preserve">Databases:  </w:t>
+        <w:t xml:space="preserve">Data:  </w:t>
       </w:r>
       <w:r>
         <w:rPr>
           <w:sz w:val="20"/>
         </w:rPr>
-        <w:t>PostgreSQL, MySQL, MongoDB, Supabase, Firebase, pgvector, BigQuery</w:t>
+        <w:t>PostgreSQL, MySQL, Supabase (Auth, Realtime, Storage, row-level security), pgvector, MongoDB, Drizzle ORM, multi-tenancy</w:t>
+      </w:r>
+    </w:p>
+    <w:p>
+      <w:pPr>
+        <w:spacing w:after="20"/>
+      </w:pPr>
+      <w:r>
+        <w:rPr>
+          <w:b/>
+          <w:sz w:val="20"/>
+        </w:rPr>
+        <w:t xml:space="preserve">AI:  </w:t>
+      </w:r>
+      <w:r>
+        <w:rPr>
+          <w:sz w:val="20"/>
+        </w:rPr>
+        <w:t>RAG, LLM APIs (OpenAI, Vertex AI), DSPy, OCR (Google Vision), speech-to-text (Whisper)</w:t>
       </w:r>
     </w:p>
     <w:p>
@@ -169,7 +189,7 @@
         <w:rPr>
           <w:sz w:val="20"/>
         </w:rPr>
-        <w:t>AWS, GCP (Cloud Run, Pub/Sub, Cloud Tasks), Docker, Linux, Supabase, Vercel, CI/CD</w:t>
+        <w:t>AWS, GCP (Cloud Run, Pub/Sub, Cloud Tasks), Vercel, Linux VPS, Nginx, Docker, CI/CD</w:t>
       </w:r>
     </w:p>
     <w:p>
@@ -187,29 +207,12 @@
         <w:rPr>
           <w:sz w:val="20"/>
         </w:rPr>
-        <w:t>Jest, Cypress, Mocha, Supertest, Karma, Protractor, GA4/GTM, Agile/Scrum, Code Review, API Design</w:t>
+        <w:t>Jest, Vitest, Cypress, Mocha, Supertest, Karma, Protractor, code review, Agile/Scrum</w:t>
       </w:r>
     </w:p>
     <w:p>
       <w:pPr>
-        <w:spacing w:after="20"/>
-      </w:pPr>
-      <w:r>
-        <w:rPr>
-          <w:b/>
-          <w:sz w:val="20"/>
-        </w:rPr>
-        <w:t xml:space="preserve">Languages:  </w:t>
-      </w:r>
-      <w:r>
-        <w:rPr>
-          <w:sz w:val="20"/>
-        </w:rPr>
-        <w:t>JavaScript, TypeScript, Python, PHP, SQL, HTML5, CSS3, C</w:t>
-      </w:r>
-    </w:p>
-    <w:p>
-      <w:pPr>
+        <w:keepNext/>
         <w:spacing w:before="160" w:after="40"/>
         <w:pBdr>
           <w:bottom w:val="single" w:sz="6" w:space="1" w:color="1D4ED8"/>
@@ -226,6 +229,7 @@
     </w:p>
     <w:p>
       <w:pPr>
+        <w:keepNext/>
         <w:spacing w:before="120"/>
       </w:pPr>
       <w:r>
@@ -233,11 +237,12 @@
           <w:b/>
           <w:sz w:val="22"/>
         </w:rPr>
-        <w:t>Software Engineer  -  Retain Health, Inc.</w:t>
+        <w:t xml:space="preserve">Software Engineer  -  Retain Health, Inc.</w:t>
       </w:r>
     </w:p>
     <w:p>
       <w:pPr>
+        <w:keepNext/>
         <w:spacing w:after="40"/>
       </w:pPr>
       <w:r>
@@ -246,11 +251,12 @@
           <w:color w:val="475569"/>
           <w:sz w:val="19"/>
         </w:rPr>
-        <w:t>Aug 2021 - Present  ·  Boston, MA (Remote)  ·  Part-time contract</w:t>
+        <w:t xml:space="preserve">Aug 2021 - Present  ·  Boston, MA (Remote)  ·  Part-time contract</w:t>
       </w:r>
     </w:p>
     <w:p>
       <w:pPr>
+        <w:keepNext/>
         <w:spacing w:after="40"/>
       </w:pPr>
       <w:r>
@@ -258,7 +264,7 @@
           <w:color w:val="475569"/>
           <w:sz w:val="19"/>
         </w:rPr>
-        <w:t>Healthcare platform with 25,000+ users focused on Alzheimer's prevention through personalized lifestyle interventions.</w:t>
+        <w:t>Healthcare platform serving 30,000+ users, focused on Alzheimer's prevention through personalized lifestyle interventions.</w:t>
       </w:r>
     </w:p>
     <w:p>
@@ -270,7 +276,7 @@
         <w:rPr>
           <w:sz w:val="20"/>
         </w:rPr>
-        <w:t>Core contributor to RetainYourBrain (retainyourbrain.com), building and maintaining production features since August 2021.</w:t>
+        <w:t>Core contributor to RetainYourBrain (retainyourbrain.com), building and maintaining production features since August 2021 across AngularJS, Next.js, TypeScript, Node.js/Express, and MySQL.</w:t>
       </w:r>
     </w:p>
     <w:p>
@@ -282,7 +288,7 @@
         <w:rPr>
           <w:sz w:val="20"/>
         </w:rPr>
-        <w:t>Built core features full-stack on AngularJS, Express.js, Next.js, Node.js, TypeScript, and MySQL.</w:t>
+        <w:t>Built a dynamic form engine with complex conditional logic that powers personalized routines and topic recommendations.</w:t>
       </w:r>
     </w:p>
     <w:p>
@@ -294,7 +300,7 @@
         <w:rPr>
           <w:sz w:val="20"/>
         </w:rPr>
-        <w:t>Designed a dynamic form system with complex conditional logic powering personalized routines and topic recommendations.</w:t>
+        <w:t>Worked extensively with AWS and React Native over the past year on the platform's cloud and mobile applications.</w:t>
       </w:r>
     </w:p>
     <w:p>
@@ -306,7 +312,7 @@
         <w:rPr>
           <w:sz w:val="20"/>
         </w:rPr>
-        <w:t>Created reusable AngularJS services with dependency injection to reduce redundant API calls and improve frontend performance.</w:t>
+        <w:t>Created reusable frontend services that reduce redundant API calls and improve performance.</w:t>
       </w:r>
     </w:p>
     <w:p>
@@ -318,7 +324,7 @@
         <w:rPr>
           <w:sz w:val="20"/>
         </w:rPr>
-        <w:t>Introduced automated testing with Jest, Cypress, Mocha, Supertest, Karma, and Protractor, plus GA4/GTM analytics.</w:t>
+        <w:t>Introduced automated testing with Jest, Cypress, Mocha, Supertest, Karma, and Protractor, plus GA4/GTM analytics, and collaborated with QA and UX/UI teams on production releases.</w:t>
       </w:r>
     </w:p>
     <w:p>
@@ -340,11 +346,12 @@
           <w:color w:val="475569"/>
           <w:sz w:val="19"/>
         </w:rPr>
-        <w:t>AngularJS, Express.js, React Native, TypeScript, MySQL, AWS, Google Analytics</w:t>
+        <w:t>AngularJS, Next.js, TypeScript, Node.js, Express.js, MySQL, AWS, React Native, Jest</w:t>
       </w:r>
     </w:p>
     <w:p>
       <w:pPr>
+        <w:keepNext/>
         <w:spacing w:before="120"/>
       </w:pPr>
       <w:r>
@@ -352,11 +359,12 @@
           <w:b/>
           <w:sz w:val="22"/>
         </w:rPr>
-        <w:t>Full-Stack &amp; AI Engineer  -  Wequity</w:t>
+        <w:t xml:space="preserve">Full-Stack &amp; AI Engineer / Team Lead  -  Wequity</w:t>
       </w:r>
     </w:p>
     <w:p>
       <w:pPr>
+        <w:keepNext/>
         <w:spacing w:after="40"/>
       </w:pPr>
       <w:r>
@@ -365,11 +373,12 @@
           <w:color w:val="475569"/>
           <w:sz w:val="19"/>
         </w:rPr>
-        <w:t>Oct 2025 - May 2026  ·  Brussels, Belgium (Remote)  ·  Part-time contract</w:t>
+        <w:t xml:space="preserve">Oct 2025 - May 2026  ·  Brussels, Belgium (Remote)  ·  Part-time contract</w:t>
       </w:r>
     </w:p>
     <w:p>
       <w:pPr>
+        <w:keepNext/>
         <w:spacing w:after="40"/>
       </w:pPr>
       <w:r>
@@ -377,7 +386,7 @@
           <w:color w:val="475569"/>
           <w:sz w:val="19"/>
         </w:rPr>
-        <w:t>Legal tech company building AI-powered tools for law firms and notaries across Belgium and the Netherlands.</w:t>
+        <w:t>Legal tech company building NORA, an AI-powered document processing platform for lawyers and notaries in Belgium and the Netherlands.</w:t>
       </w:r>
     </w:p>
     <w:p>
@@ -389,7 +398,7 @@
         <w:rPr>
           <w:sz w:val="20"/>
         </w:rPr>
-        <w:t>Built full-stack features for NORA, an AI-powered legal document processing platform handling English, French, and Dutch documents on React, FastAPI, and Supabase.</w:t>
+        <w:t>Served as team lead during an eight-month contract: reviewed pull requests and owned deployments.</w:t>
       </w:r>
     </w:p>
     <w:p>
@@ -401,7 +410,7 @@
         <w:rPr>
           <w:sz w:val="20"/>
         </w:rPr>
-        <w:t>Built a Smart Processing module that learns document transformation patterns from example pairs using LLM APIs and DSPy.</w:t>
+        <w:t>Developed Python/FastAPI backend services and React frontend features, using Supabase for application data and storage.</w:t>
       </w:r>
     </w:p>
     <w:p>
@@ -413,7 +422,7 @@
         <w:rPr>
           <w:sz w:val="20"/>
         </w:rPr>
-        <w:t>Developed a RAG-based Knowledge Base where users query uploaded legal documents and get AI-generated answers with source citations.</w:t>
+        <w:t>Built a RAG knowledge base that answers questions over uploaded legal documents with source citations.</w:t>
       </w:r>
     </w:p>
     <w:p>
@@ -425,7 +434,7 @@
         <w:rPr>
           <w:sz w:val="20"/>
         </w:rPr>
-        <w:t>Integrated the DeepL API for legal document translation across English, French, and Dutch.</w:t>
+        <w:t>Developed Smart Processing workflows that learn document transformation patterns from example pairs using LLM APIs and DSPy.</w:t>
       </w:r>
     </w:p>
     <w:p>
@@ -437,7 +446,19 @@
         <w:rPr>
           <w:sz w:val="20"/>
         </w:rPr>
-        <w:t>Designed background task architecture using Google Cloud Tasks and Pub/Sub for async document processing.</w:t>
+        <w:t>Integrated Google Vision API OCR to extract text from scanned and image-based PDFs for downstream processing.</w:t>
+      </w:r>
+    </w:p>
+    <w:p>
+      <w:pPr>
+        <w:pStyle w:val="ListBullet"/>
+        <w:spacing w:after="20"/>
+      </w:pPr>
+      <w:r>
+        <w:rPr>
+          <w:sz w:val="20"/>
+        </w:rPr>
+        <w:t>Designed asynchronous processing with Google Cloud Tasks and Pub/Sub, and integrated DeepL translation for English, French, and Dutch documents.</w:t>
       </w:r>
     </w:p>
     <w:p>
@@ -459,11 +480,12 @@
           <w:color w:val="475569"/>
           <w:sz w:val="19"/>
         </w:rPr>
-        <w:t>React, FastAPI, Supabase, GCP, Vertex AI, LLM Integration, OpenAI API, DSPy, BigQuery, DeepL</w:t>
+        <w:t>Python, FastAPI, React, Supabase, GCP (Vertex AI, Vision API, Cloud Tasks, Pub/Sub), LLM APIs, DSPy, DeepL</w:t>
       </w:r>
     </w:p>
     <w:p>
       <w:pPr>
+        <w:keepNext/>
         <w:spacing w:before="120"/>
       </w:pPr>
       <w:r>
@@ -471,11 +493,12 @@
           <w:b/>
           <w:sz w:val="22"/>
         </w:rPr>
-        <w:t>Freelance Web Developer  -  Upwork (Top Rated)</w:t>
+        <w:t xml:space="preserve">Freelance Full-Stack Developer  -  Upwork (Top Rated)</w:t>
       </w:r>
     </w:p>
     <w:p>
       <w:pPr>
+        <w:keepNext/>
         <w:spacing w:after="40"/>
       </w:pPr>
       <w:r>
@@ -484,11 +507,12 @@
           <w:color w:val="475569"/>
           <w:sz w:val="19"/>
         </w:rPr>
-        <w:t>Aug 2024 - Present  ·  Worldwide (Remote)  ·  Self-employed</w:t>
+        <w:t xml:space="preserve">Aug 2024 - Present  ·  Worldwide (Remote)  ·  Self-employed</w:t>
       </w:r>
     </w:p>
     <w:p>
       <w:pPr>
+        <w:keepNext/>
         <w:spacing w:after="40"/>
       </w:pPr>
       <w:r>
@@ -496,7 +520,7 @@
           <w:color w:val="475569"/>
           <w:sz w:val="19"/>
         </w:rPr>
-        <w:t>Build web applications, custom Shopify themes, e-commerce stores, and landing pages for individuals and businesses.</w:t>
+        <w:t>Top Rated freelancer with a 100% Job Success Score and a 5.0 rating across seven reviews.</w:t>
       </w:r>
     </w:p>
     <w:p>
@@ -508,7 +532,7 @@
         <w:rPr>
           <w:sz w:val="20"/>
         </w:rPr>
-        <w:t>Completed seven Upwork contracts, each rated 5 stars, with a 100% Job Success Score.</w:t>
+        <w:t>Built web applications, booking systems, custom Shopify themes, and e-commerce stores for international clients, including repeat client engagements.</w:t>
       </w:r>
     </w:p>
     <w:p>
@@ -520,7 +544,7 @@
         <w:rPr>
           <w:sz w:val="20"/>
         </w:rPr>
-        <w:t>Built the Martinez Auto Detail booking system with dynamic pricing and Square-powered card storage.</w:t>
+        <w:t>Delivered Martinez Auto Detail's booking system with dynamic pricing, custom scheduling rules, Square-powered card storage, and an owner dashboard.</w:t>
       </w:r>
     </w:p>
     <w:p>
@@ -532,7 +556,7 @@
         <w:rPr>
           <w:sz w:val="20"/>
         </w:rPr>
-        <w:t>Developed Socialura (socialura.alabaganne.com), a WordPress site with Stripe checkout for digital service sales.</w:t>
+        <w:t>Developed Socialura, a WordPress storefront with Stripe checkout for digital-service sales.</w:t>
       </w:r>
     </w:p>
     <w:p>
@@ -554,11 +578,12 @@
           <w:color w:val="475569"/>
           <w:sz w:val="19"/>
         </w:rPr>
-        <w:t>Next.js, React, Node.js, Tailwind, Supabase, Stripe, Square, Shopify, WordPress</w:t>
+        <w:t>Next.js, React, Node.js, Supabase, Shopify, WordPress, Stripe, Square</w:t>
       </w:r>
     </w:p>
     <w:p>
       <w:pPr>
+        <w:keepNext/>
         <w:spacing w:before="120"/>
       </w:pPr>
       <w:r>
@@ -566,11 +591,12 @@
           <w:b/>
           <w:sz w:val="22"/>
         </w:rPr>
-        <w:t>Full-Stack Developer Intern  -  Satoripop</w:t>
+        <w:t xml:space="preserve">Full-Stack Developer Intern  -  Satoripop</w:t>
       </w:r>
     </w:p>
     <w:p>
       <w:pPr>
+        <w:keepNext/>
         <w:spacing w:after="40"/>
       </w:pPr>
       <w:r>
@@ -579,19 +605,7 @@
           <w:color w:val="475569"/>
           <w:sz w:val="19"/>
         </w:rPr>
-        <w:t>Jul 2023 - Aug 2023  ·  Sousse, Tunisia (Hybrid)</w:t>
-      </w:r>
-    </w:p>
-    <w:p>
-      <w:pPr>
-        <w:spacing w:after="40"/>
-      </w:pPr>
-      <w:r>
-        <w:rPr>
-          <w:color w:val="475569"/>
-          <w:sz w:val="19"/>
-        </w:rPr>
-        <w:t>Built a Google Meet-style video meeting platform independently during the internship.</w:t>
+        <w:t xml:space="preserve">Jul 2023 - Aug 2023  ·  Sousse, Tunisia (Hybrid)</w:t>
       </w:r>
     </w:p>
     <w:p>
@@ -603,7 +617,7 @@
         <w:rPr>
           <w:sz w:val="20"/>
         </w:rPr>
-        <w:t>Built a video meeting platform with authentication, meeting creation, scheduling, protected pages, and Jitsi-powered calls.</w:t>
+        <w:t>Independently built a Google Meet-style video meeting app (jitsi.alabaganne.com) with authentication, roles, protected pages, meeting creation, and scheduling.</w:t>
       </w:r>
     </w:p>
     <w:p>
@@ -615,7 +629,7 @@
         <w:rPr>
           <w:sz w:val="20"/>
         </w:rPr>
-        <w:t>Delivered both frontend and backend independently with React, TypeScript, Express.js, and MySQL.</w:t>
+        <w:t>Delivered the React/TypeScript interface and Express.js/MySQL APIs, integrating the Jitsi SDK into the meeting workflow.</w:t>
       </w:r>
     </w:p>
     <w:p>
@@ -642,6 +656,7 @@
     </w:p>
     <w:p>
       <w:pPr>
+        <w:keepNext/>
         <w:spacing w:before="120"/>
       </w:pPr>
       <w:r>
@@ -649,11 +664,12 @@
           <w:b/>
           <w:sz w:val="22"/>
         </w:rPr>
-        <w:t>Full-Stack Developer Intern  -  Realinflo</w:t>
+        <w:t xml:space="preserve">Full-Stack Developer Intern  -  Realinflo</w:t>
       </w:r>
     </w:p>
     <w:p>
       <w:pPr>
+        <w:keepNext/>
         <w:spacing w:after="40"/>
       </w:pPr>
       <w:r>
@@ -662,19 +678,7 @@
           <w:color w:val="475569"/>
           <w:sz w:val="19"/>
         </w:rPr>
-        <w:t>Feb 2021 - May 2021  ·  Hong Kong SAR (Remote)</w:t>
-      </w:r>
-    </w:p>
-    <w:p>
-      <w:pPr>
-        <w:spacing w:after="40"/>
-      </w:pPr>
-      <w:r>
-        <w:rPr>
-          <w:color w:val="475569"/>
-          <w:sz w:val="19"/>
-        </w:rPr>
-        <w:t>Built an admin dashboard for a real estate intelligence platform, working directly with the CTO via weekly milestones.</w:t>
+        <w:t xml:space="preserve">Feb 2021 - May 2021  ·  Hong Kong SAR (Remote)</w:t>
       </w:r>
     </w:p>
     <w:p>
@@ -686,7 +690,7 @@
         <w:rPr>
           <w:sz w:val="20"/>
         </w:rPr>
-        <w:t>Built an admin dashboard with Vue.js and Node.js to manage and visualize property data.</w:t>
+        <w:t>Built an administration dashboard for a real estate intelligence platform, with interfaces to manage, visualize, and report on property data (Vue.js/Quasar, Node.js/Feathers.js, MongoDB).</w:t>
       </w:r>
     </w:p>
     <w:p>
@@ -698,7 +702,7 @@
         <w:rPr>
           <w:sz w:val="20"/>
         </w:rPr>
-        <w:t>Delivered enhanced data visualization and reporting through weekly milestone reviews with the CTO.</w:t>
+        <w:t>Delivered frontend and backend improvements through weekly milestone reviews with the CTO and the Hong Kong team.</w:t>
       </w:r>
     </w:p>
     <w:p>
@@ -725,6 +729,7 @@
     </w:p>
     <w:p>
       <w:pPr>
+        <w:keepNext/>
         <w:spacing w:before="120"/>
       </w:pPr>
       <w:r>
@@ -732,11 +737,12 @@
           <w:b/>
           <w:sz w:val="22"/>
         </w:rPr>
-        <w:t>Web Development Intern  -  Satoripop</w:t>
+        <w:t xml:space="preserve">Web Development Intern  -  Satoripop</w:t>
       </w:r>
     </w:p>
     <w:p>
       <w:pPr>
+        <w:keepNext/>
         <w:spacing w:after="40"/>
       </w:pPr>
       <w:r>
@@ -745,11 +751,12 @@
           <w:color w:val="475569"/>
           <w:sz w:val="19"/>
         </w:rPr>
-        <w:t>Jul 2020 - Aug 2020  ·  Sousse, Tunisia (Hybrid)</w:t>
+        <w:t xml:space="preserve">Jul 2020 - Aug 2020  ·  Sousse, Tunisia (Hybrid)</w:t>
       </w:r>
     </w:p>
     <w:p>
       <w:pPr>
+        <w:keepNext/>
         <w:spacing w:after="40"/>
       </w:pPr>
       <w:r>
@@ -757,7 +764,7 @@
           <w:color w:val="475569"/>
           <w:sz w:val="19"/>
         </w:rPr>
-        <w:t>Developed a web application to manage company employees and converted a PSD landing page into a fully responsive site.</w:t>
+        <w:t>Learned Laravel and Vue.js during the internship and independently built an employee management application for the company's HR manager.</w:t>
       </w:r>
     </w:p>
     <w:p>
@@ -769,7 +776,7 @@
         <w:rPr>
           <w:sz w:val="20"/>
         </w:rPr>
-        <w:t>Built Satoripop RH, a Vue.js and Laravel HR platform with role-based dashboards for managers, HR, project managers, and employees.</w:t>
+        <w:t>Built the Laravel backend and Vue.js frontend with authentication, employee records, and role-based dashboards, and documented the API with Swagger/OpenAPI.</w:t>
       </w:r>
     </w:p>
     <w:p>
@@ -781,19 +788,7 @@
         <w:rPr>
           <w:sz w:val="20"/>
         </w:rPr>
-        <w:t>Documented backend API endpoints using Swagger/OpenAPI for clean handoff.</w:t>
-      </w:r>
-    </w:p>
-    <w:p>
-      <w:pPr>
-        <w:pStyle w:val="ListBullet"/>
-        <w:spacing w:after="20"/>
-      </w:pPr>
-      <w:r>
-        <w:rPr>
-          <w:sz w:val="20"/>
-        </w:rPr>
-        <w:t>Converted a PSD landing-page design into a responsive e-commerce front-end with hand-written HTML, CSS, and JavaScript.</w:t>
+        <w:t>Converted a supplied PSD design into a responsive e-commerce interface with HTML, CSS, JavaScript, and Bootstrap.</w:t>
       </w:r>
     </w:p>
     <w:p>
@@ -820,6 +815,7 @@
     </w:p>
     <w:p>
       <w:pPr>
+        <w:keepNext/>
         <w:spacing w:before="160" w:after="40"/>
         <w:pBdr>
           <w:bottom w:val="single" w:sz="6" w:space="1" w:color="1D4ED8"/>
@@ -849,7 +845,7 @@
         <w:rPr>
           <w:sz w:val="20"/>
         </w:rPr>
-        <w:t>SaaS I founded for restaurants: QR-code digital menus, real-time ordering, and an admin dashboard. SEO-optimized and multilingual. Next.js, React, Supabase, Tailwind.</w:t>
+        <w:t>Founded, designed, and built a multi-tenant restaurant SaaS: digital menus, table QR codes, real-time orders on an admin dashboard, staff access, configurable themes, and multilingual public menus. Next.js, React, TypeScript, Supabase, PostgreSQL.</w:t>
       </w:r>
     </w:p>
     <w:p>
@@ -861,13 +857,13 @@
           <w:b/>
           <w:sz w:val="20"/>
         </w:rPr>
-        <w:t xml:space="preserve">Martinez Auto Detail (booking.martinezautodetailwa.com) - </w:t>
+        <w:t xml:space="preserve">KartaTunisie (kartatunisie.com) - </w:t>
       </w:r>
       <w:r>
         <w:rPr>
           <w:sz w:val="20"/>
         </w:rPr>
-        <w:t>Custom booking system with service selection, dynamic pricing, date/time picking, Square-powered card storage, and an owner dashboard. Next.js, React, Tailwind, Square API.</w:t>
+        <w:t>Designed, built, and launched a gift card and AI subscription store for Tunisia in French, English, and Arabic, paid in dinars by bank transfer or cash, with code delivery by email and a role-based admin dashboard. Self-hosted on a VPS. Next.js, TypeScript, MySQL, Drizzle, Tailwind CSS.</w:t>
       </w:r>
     </w:p>
     <w:p>
@@ -879,13 +875,13 @@
           <w:b/>
           <w:sz w:val="20"/>
         </w:rPr>
-        <w:t xml:space="preserve">LeBonBureau (lebonbureau.alabaganne.com) - </w:t>
+        <w:t xml:space="preserve">PromptStream (promptstream.alabaganne.com) - </w:t>
       </w:r>
       <w:r>
         <w:rPr>
           <w:sz w:val="20"/>
         </w:rPr>
-        <w:t>Polished e-commerce storefront for an office-furniture brand with a refined responsive design, product catalog, and admin dashboard. Next.js, React, TypeScript, Supabase.</w:t>
+        <w:t>System-wide AI dictation app for Linux and macOS: hold a key, speak, and cleaned-up text is pasted into the focused app, including native Wayland windows. Electron, React, TypeScript, Next.js, Supabase, Whisper.</w:t>
       </w:r>
     </w:p>
     <w:p>
@@ -903,7 +899,7 @@
         <w:rPr>
           <w:sz w:val="20"/>
         </w:rPr>
-        <w:t>Internship platform (end-of-studies project) where students apply to internships and companies post opportunities, with real-time notifications, tracking, and dashboards. Laravel, Vue.js, Inertia.js, MySQL, Pusher.</w:t>
+        <w:t>End-of-studies internship platform connecting students and companies, with listings, applications, messaging, real-time notifications, and role-based access. Laravel, Vue.js, Inertia.js, Tailwind CSS, MySQL, Pusher.</w:t>
       </w:r>
     </w:p>
     <w:p>
@@ -915,45 +911,18 @@
           <w:b/>
           <w:sz w:val="20"/>
         </w:rPr>
-        <w:t xml:space="preserve">Global Deals (global-deals.vercel.app) - </w:t>
+        <w:t xml:space="preserve">Resume Studio (react-resume-studio.vercel.app) - </w:t>
       </w:r>
       <w:r>
         <w:rPr>
           <w:sz w:val="20"/>
         </w:rPr>
-        <w:t>Interactive 3D globe with event markers, clustering, and Bezier line visualizations; admin panel and authentication. React 18, Mapbox GL JS, Supabase, Tiptap.</w:t>
+        <w:t>Browser-based résumé builder with saved résumés, a guided editor with live preview, templates, and PDF and Word export. Next.js, React, TypeScript, Tailwind CSS.</w:t>
       </w:r>
     </w:p>
     <w:p>
       <w:pPr>
-        <w:spacing w:after="40"/>
-      </w:pPr>
-      <w:r>
-        <w:rPr>
-          <w:b/>
-          <w:sz w:val="20"/>
-        </w:rPr>
-        <w:t xml:space="preserve">ATS Resume Builder (ats-react-resume-builder.vercel.app) - </w:t>
-      </w:r>
-      <w:r>
-        <w:rPr>
-          <w:sz w:val="20"/>
-        </w:rPr>
-        <w:t>Resume builder with structured templates, real-time preview, and one-click PDF export. Next.js, React, Tailwind, jsPDF.</w:t>
-      </w:r>
-    </w:p>
-    <w:p>
-      <w:r>
-        <w:rPr>
-          <w:i/>
-          <w:color w:val="475569"/>
-          <w:sz w:val="19"/>
-        </w:rPr>
-        <w:t>More live demos available at alabaganne.com.</w:t>
-      </w:r>
-    </w:p>
-    <w:p>
-      <w:pPr>
+        <w:keepNext/>
         <w:spacing w:before="160" w:after="40"/>
         <w:pBdr>
           <w:bottom w:val="single" w:sz="6" w:space="1" w:color="1D4ED8"/>
@@ -984,7 +953,7 @@
           <w:color w:val="475569"/>
           <w:sz w:val="19"/>
         </w:rPr>
-        <w:t>- ISSAT Sousse, Tunisia  ·  Sep 2021 - Jun 2024</w:t>
+        <w:t xml:space="preserve">- ISSAT Sousse, Tunisia  ·  Sep 2021 - Jun 2024</w:t>
       </w:r>
     </w:p>
     <w:p>
@@ -1003,11 +972,12 @@
           <w:color w:val="475569"/>
           <w:sz w:val="19"/>
         </w:rPr>
-        <w:t>- ISSAT Sousse, Tunisia  ·  2018 - Jul 2021</w:t>
+        <w:t xml:space="preserve">- ISSAT Sousse, Tunisia  ·  Oct 2018 - Jul 2021</w:t>
       </w:r>
     </w:p>
     <w:p>
       <w:pPr>
+        <w:keepNext/>
         <w:spacing w:before="160" w:after="40"/>
         <w:pBdr>
           <w:bottom w:val="single" w:sz="6" w:space="1" w:color="1D4ED8"/>
@@ -1019,7 +989,7 @@
           <w:color w:val="1D4ED8"/>
           <w:sz w:val="22"/>
         </w:rPr>
-        <w:t>CERTIFICATIONS</w:t>
+        <w:t>CERTIFICATIONS &amp; LANGUAGES</w:t>
       </w:r>
     </w:p>
     <w:p>
@@ -1027,23 +997,7 @@
         <w:rPr>
           <w:sz w:val="20"/>
         </w:rPr>
-        <w:t>Cisco CCNA: Introduction to Networks (2022)  ·  Microsoft MTA: Python, Database Fundamentals, JavaScript, HTML/CSS (2019-2021)</w:t>
-      </w:r>
-    </w:p>
-    <w:p>
-      <w:pPr>
-        <w:spacing w:before="160" w:after="40"/>
-        <w:pBdr>
-          <w:bottom w:val="single" w:sz="6" w:space="1" w:color="1D4ED8"/>
-        </w:pBdr>
-      </w:pPr>
-      <w:r>
-        <w:rPr>
-          <w:b/>
-          <w:color w:val="1D4ED8"/>
-          <w:sz w:val="22"/>
-        </w:rPr>
-        <w:t>LANGUAGES</w:t>
+        <w:t xml:space="preserve">Cisco CCNA: Introduction to Networks (2022)  ·  Microsoft MTA: Python, Database Fundamentals, JavaScript, HTML/CSS</w:t>
       </w:r>
     </w:p>
     <w:p>
@@ -1051,11 +1005,11 @@
         <w:rPr>
           <w:sz w:val="20"/>
         </w:rPr>
-        <w:t>English (Fluent)  ·  French (Intermediate)  ·  Arabic (Native)</w:t>
+        <w:t xml:space="preserve">Languages: English (Bilingual)  ·  French (Professional)  ·  Arabic (Native)</w:t>
       </w:r>
     </w:p>
     <w:sectPr>
-      <w:pgSz w:w="12240" w:h="15840"/>
+      <w:pgSz w:w="11906" w:h="16838"/>
       <w:pgMar w:top="864" w:right="864" w:bottom="864" w:left="864" w:header="720" w:footer="720" w:gutter="0"/>
       <w:cols w:space="720"/>
       <w:docGrid w:linePitch="360"/>

</xml_diff>